<commit_message>
Drop non-schema highlightCs from generated documents
Co-Authored-By: Claude Opus 5.5 <noreply@anthropic.com>
Claude-Session: https://claude.ai/code/session_01KeeuK4qVpzTPDQXDYVJKg1
</commit_message>
<xml_diff>
--- a/другие предметы/ЛР4 Мониторинг и инциденты/ЛР4 — отчёт.docx
+++ b/другие предметы/ЛР4 Мониторинг и инциденты/ЛР4 — отчёт.docx
@@ -1841,7 +1841,6 @@
       <w:r>
         <w:rPr>
           <w:highlight w:val="yellow"/>
-          <w:highlightCs w:val="yellow"/>
         </w:rPr>
         <w:t xml:space="preserve">третий сайт</w:t>
       </w:r>
@@ -1851,7 +1850,6 @@
       <w:r>
         <w:rPr>
           <w:highlight w:val="yellow"/>
-          <w:highlightCs w:val="yellow"/>
         </w:rPr>
         <w:t xml:space="preserve">N</w:t>
       </w:r>
@@ -2432,7 +2430,6 @@
                 <w:sz w:val="24"/>
                 <w:szCs w:val="24"/>
                 <w:highlight w:val="yellow"/>
-                <w:highlightCs w:val="yellow"/>
               </w:rPr>
               <w:t xml:space="preserve">Up</w:t>
             </w:r>
@@ -2463,7 +2460,6 @@
                 <w:sz w:val="24"/>
                 <w:szCs w:val="24"/>
                 <w:highlight w:val="yellow"/>
-                <w:highlightCs w:val="yellow"/>
               </w:rPr>
               <w:t xml:space="preserve">…</w:t>
             </w:r>
@@ -2494,7 +2490,6 @@
                 <w:sz w:val="24"/>
                 <w:szCs w:val="24"/>
                 <w:highlight w:val="yellow"/>
-                <w:highlightCs w:val="yellow"/>
               </w:rPr>
               <w:t xml:space="preserve">…</w:t>
             </w:r>
@@ -2588,7 +2583,6 @@
                 <w:sz w:val="24"/>
                 <w:szCs w:val="24"/>
                 <w:highlight w:val="yellow"/>
-                <w:highlightCs w:val="yellow"/>
               </w:rPr>
               <w:t xml:space="preserve">Up</w:t>
             </w:r>
@@ -2619,7 +2613,6 @@
                 <w:sz w:val="24"/>
                 <w:szCs w:val="24"/>
                 <w:highlight w:val="yellow"/>
-                <w:highlightCs w:val="yellow"/>
               </w:rPr>
               <w:t xml:space="preserve">…</w:t>
             </w:r>
@@ -2650,7 +2643,6 @@
                 <w:sz w:val="24"/>
                 <w:szCs w:val="24"/>
                 <w:highlight w:val="yellow"/>
-                <w:highlightCs w:val="yellow"/>
               </w:rPr>
               <w:t xml:space="preserve">…</w:t>
             </w:r>
@@ -2715,7 +2707,6 @@
                 <w:sz w:val="24"/>
                 <w:szCs w:val="24"/>
                 <w:highlight w:val="yellow"/>
-                <w:highlightCs w:val="yellow"/>
               </w:rPr>
               <w:t xml:space="preserve">выбранный сайт</w:t>
             </w:r>
@@ -2746,7 +2737,6 @@
                 <w:sz w:val="24"/>
                 <w:szCs w:val="24"/>
                 <w:highlight w:val="yellow"/>
-                <w:highlightCs w:val="yellow"/>
               </w:rPr>
               <w:t xml:space="preserve">Up</w:t>
             </w:r>
@@ -2777,7 +2767,6 @@
                 <w:sz w:val="24"/>
                 <w:szCs w:val="24"/>
                 <w:highlight w:val="yellow"/>
-                <w:highlightCs w:val="yellow"/>
               </w:rPr>
               <w:t xml:space="preserve">…</w:t>
             </w:r>
@@ -2808,7 +2797,6 @@
                 <w:sz w:val="24"/>
                 <w:szCs w:val="24"/>
                 <w:highlight w:val="yellow"/>
-                <w:highlightCs w:val="yellow"/>
               </w:rPr>
               <w:t xml:space="preserve">…</w:t>
             </w:r>
@@ -2863,7 +2851,6 @@
       <w:r>
         <w:rPr>
           <w:highlight w:val="yellow"/>
-          <w:highlightCs w:val="yellow"/>
         </w:rPr>
         <w:t xml:space="preserve">перечислите из раздела Integrations / Alert Contacts</w:t>
       </w:r>
@@ -4002,7 +3989,6 @@
       <w:r>
         <w:rPr>
           <w:highlight w:val="yellow"/>
-          <w:highlightCs w:val="yellow"/>
         </w:rPr>
         <w:t xml:space="preserve">второй сайт</w:t>
       </w:r>
@@ -4206,7 +4192,6 @@
           <w:sz w:val="24"/>
           <w:szCs w:val="24"/>
           <w:highlight w:val="yellow"/>
-          <w:highlightCs w:val="yellow"/>
         </w:rPr>
         <w:t xml:space="preserve">второй сайт</w:t>
       </w:r>
@@ -4286,7 +4271,6 @@
           <w:sz w:val="24"/>
           <w:szCs w:val="24"/>
           <w:highlight w:val="yellow"/>
-          <w:highlightCs w:val="yellow"/>
         </w:rPr>
         <w:t xml:space="preserve">второй сайт</w:t>
       </w:r>
@@ -4366,7 +4350,6 @@
           <w:sz w:val="24"/>
           <w:szCs w:val="24"/>
           <w:highlight w:val="yellow"/>
-          <w:highlightCs w:val="yellow"/>
         </w:rPr>
         <w:t xml:space="preserve">второй сайт</w:t>
       </w:r>
@@ -4690,7 +4673,6 @@
                 <w:sz w:val="24"/>
                 <w:szCs w:val="24"/>
                 <w:highlight w:val="yellow"/>
-                <w:highlightCs w:val="yellow"/>
               </w:rPr>
               <w:t xml:space="preserve">…</w:t>
             </w:r>
@@ -4721,7 +4703,6 @@
                 <w:sz w:val="24"/>
                 <w:szCs w:val="24"/>
                 <w:highlight w:val="yellow"/>
-                <w:highlightCs w:val="yellow"/>
               </w:rPr>
               <w:t xml:space="preserve">…</w:t>
             </w:r>
@@ -4752,7 +4733,6 @@
                 <w:sz w:val="24"/>
                 <w:szCs w:val="24"/>
                 <w:highlight w:val="yellow"/>
-                <w:highlightCs w:val="yellow"/>
               </w:rPr>
               <w:t xml:space="preserve">…</w:t>
             </w:r>
@@ -4783,7 +4763,6 @@
                 <w:sz w:val="24"/>
                 <w:szCs w:val="24"/>
                 <w:highlight w:val="yellow"/>
-                <w:highlightCs w:val="yellow"/>
               </w:rPr>
               <w:t xml:space="preserve">…</w:t>
             </w:r>
@@ -4814,7 +4793,6 @@
                 <w:sz w:val="24"/>
                 <w:szCs w:val="24"/>
                 <w:highlight w:val="yellow"/>
-                <w:highlightCs w:val="yellow"/>
               </w:rPr>
               <w:t xml:space="preserve">…</w:t>
             </w:r>
@@ -4908,7 +4886,6 @@
                 <w:sz w:val="24"/>
                 <w:szCs w:val="24"/>
                 <w:highlight w:val="yellow"/>
-                <w:highlightCs w:val="yellow"/>
               </w:rPr>
               <w:t xml:space="preserve">…</w:t>
             </w:r>
@@ -4939,7 +4916,6 @@
                 <w:sz w:val="24"/>
                 <w:szCs w:val="24"/>
                 <w:highlight w:val="yellow"/>
-                <w:highlightCs w:val="yellow"/>
               </w:rPr>
               <w:t xml:space="preserve">…</w:t>
             </w:r>
@@ -4970,7 +4946,6 @@
                 <w:sz w:val="24"/>
                 <w:szCs w:val="24"/>
                 <w:highlight w:val="yellow"/>
-                <w:highlightCs w:val="yellow"/>
               </w:rPr>
               <w:t xml:space="preserve">…</w:t>
             </w:r>
@@ -5001,7 +4976,6 @@
                 <w:sz w:val="24"/>
                 <w:szCs w:val="24"/>
                 <w:highlight w:val="yellow"/>
-                <w:highlightCs w:val="yellow"/>
               </w:rPr>
               <w:t xml:space="preserve">…</w:t>
             </w:r>
@@ -5032,7 +5006,6 @@
                 <w:sz w:val="24"/>
                 <w:szCs w:val="24"/>
                 <w:highlight w:val="yellow"/>
-                <w:highlightCs w:val="yellow"/>
               </w:rPr>
               <w:t xml:space="preserve">…</w:t>
             </w:r>
@@ -5097,7 +5070,6 @@
                 <w:sz w:val="24"/>
                 <w:szCs w:val="24"/>
                 <w:highlight w:val="yellow"/>
-                <w:highlightCs w:val="yellow"/>
               </w:rPr>
               <w:t xml:space="preserve">второй сайт</w:t>
             </w:r>
@@ -5128,7 +5100,6 @@
                 <w:sz w:val="24"/>
                 <w:szCs w:val="24"/>
                 <w:highlight w:val="yellow"/>
-                <w:highlightCs w:val="yellow"/>
               </w:rPr>
               <w:t xml:space="preserve">…</w:t>
             </w:r>
@@ -5159,7 +5130,6 @@
                 <w:sz w:val="24"/>
                 <w:szCs w:val="24"/>
                 <w:highlight w:val="yellow"/>
-                <w:highlightCs w:val="yellow"/>
               </w:rPr>
               <w:t xml:space="preserve">…</w:t>
             </w:r>
@@ -5190,7 +5160,6 @@
                 <w:sz w:val="24"/>
                 <w:szCs w:val="24"/>
                 <w:highlight w:val="yellow"/>
-                <w:highlightCs w:val="yellow"/>
               </w:rPr>
               <w:t xml:space="preserve">…</w:t>
             </w:r>
@@ -5221,7 +5190,6 @@
                 <w:sz w:val="24"/>
                 <w:szCs w:val="24"/>
                 <w:highlight w:val="yellow"/>
-                <w:highlightCs w:val="yellow"/>
               </w:rPr>
               <w:t xml:space="preserve">…</w:t>
             </w:r>
@@ -5252,7 +5220,6 @@
                 <w:sz w:val="24"/>
                 <w:szCs w:val="24"/>
                 <w:highlight w:val="yellow"/>
-                <w:highlightCs w:val="yellow"/>
               </w:rPr>
               <w:t xml:space="preserve">…</w:t>
             </w:r>
@@ -5317,7 +5284,6 @@
                 <w:sz w:val="24"/>
                 <w:szCs w:val="24"/>
                 <w:highlight w:val="yellow"/>
-                <w:highlightCs w:val="yellow"/>
               </w:rPr>
               <w:t xml:space="preserve">второй сайт</w:t>
             </w:r>
@@ -5348,7 +5314,6 @@
                 <w:sz w:val="24"/>
                 <w:szCs w:val="24"/>
                 <w:highlight w:val="yellow"/>
-                <w:highlightCs w:val="yellow"/>
               </w:rPr>
               <w:t xml:space="preserve">…</w:t>
             </w:r>
@@ -5379,7 +5344,6 @@
                 <w:sz w:val="24"/>
                 <w:szCs w:val="24"/>
                 <w:highlight w:val="yellow"/>
-                <w:highlightCs w:val="yellow"/>
               </w:rPr>
               <w:t xml:space="preserve">…</w:t>
             </w:r>
@@ -5410,7 +5374,6 @@
                 <w:sz w:val="24"/>
                 <w:szCs w:val="24"/>
                 <w:highlight w:val="yellow"/>
-                <w:highlightCs w:val="yellow"/>
               </w:rPr>
               <w:t xml:space="preserve">…</w:t>
             </w:r>
@@ -5441,7 +5404,6 @@
                 <w:sz w:val="24"/>
                 <w:szCs w:val="24"/>
                 <w:highlight w:val="yellow"/>
-                <w:highlightCs w:val="yellow"/>
               </w:rPr>
               <w:t xml:space="preserve">…</w:t>
             </w:r>
@@ -5472,7 +5434,6 @@
                 <w:sz w:val="24"/>
                 <w:szCs w:val="24"/>
                 <w:highlight w:val="yellow"/>
-                <w:highlightCs w:val="yellow"/>
               </w:rPr>
               <w:t xml:space="preserve">…</w:t>
             </w:r>
@@ -5720,7 +5681,6 @@
                 <w:sz w:val="24"/>
                 <w:szCs w:val="24"/>
                 <w:highlight w:val="yellow"/>
-                <w:highlightCs w:val="yellow"/>
               </w:rPr>
               <w:t xml:space="preserve">Сократите неиспользуемый JavaScript</w:t>
             </w:r>
@@ -5814,7 +5774,6 @@
                 <w:sz w:val="24"/>
                 <w:szCs w:val="24"/>
                 <w:highlight w:val="yellow"/>
-                <w:highlightCs w:val="yellow"/>
               </w:rPr>
               <w:t xml:space="preserve">Сократите время выполнения JavaScript / работу в основном потоке</w:t>
             </w:r>
@@ -5908,7 +5867,6 @@
                 <w:sz w:val="24"/>
                 <w:szCs w:val="24"/>
                 <w:highlight w:val="yellow"/>
-                <w:highlightCs w:val="yellow"/>
               </w:rPr>
               <w:t xml:space="preserve">Используйте современные форматы изображений (WebP/AVIF)</w:t>
             </w:r>
@@ -5973,7 +5931,6 @@
                 <w:sz w:val="24"/>
                 <w:szCs w:val="24"/>
                 <w:highlight w:val="yellow"/>
-                <w:highlightCs w:val="yellow"/>
               </w:rPr>
               <w:t xml:space="preserve">второй сайт</w:t>
             </w:r>
@@ -6004,7 +5961,6 @@
                 <w:sz w:val="24"/>
                 <w:szCs w:val="24"/>
                 <w:highlight w:val="yellow"/>
-                <w:highlightCs w:val="yellow"/>
               </w:rPr>
               <w:t xml:space="preserve">Устраните ресурсы, блокирующие отрисовку</w:t>
             </w:r>
@@ -6069,7 +6025,6 @@
                 <w:sz w:val="24"/>
                 <w:szCs w:val="24"/>
                 <w:highlight w:val="yellow"/>
-                <w:highlightCs w:val="yellow"/>
               </w:rPr>
               <w:t xml:space="preserve">второй сайт</w:t>
             </w:r>
@@ -6100,7 +6055,6 @@
                 <w:sz w:val="24"/>
                 <w:szCs w:val="24"/>
                 <w:highlight w:val="yellow"/>
-                <w:highlightCs w:val="yellow"/>
               </w:rPr>
               <w:t xml:space="preserve">Сократите время ответа сервера (TTFB)</w:t>
             </w:r>
@@ -6165,7 +6119,6 @@
                 <w:sz w:val="24"/>
                 <w:szCs w:val="24"/>
                 <w:highlight w:val="yellow"/>
-                <w:highlightCs w:val="yellow"/>
               </w:rPr>
               <w:t xml:space="preserve">второй сайт</w:t>
             </w:r>
@@ -6196,7 +6149,6 @@
                 <w:sz w:val="24"/>
                 <w:szCs w:val="24"/>
                 <w:highlight w:val="yellow"/>
-                <w:highlightCs w:val="yellow"/>
               </w:rPr>
               <w:t xml:space="preserve">Настройте эффективную политику кеширования статических ресурсов</w:t>
             </w:r>
@@ -6258,7 +6210,6 @@
       <w:r>
         <w:rPr>
           <w:highlight w:val="yellow"/>
-          <w:highlightCs w:val="yellow"/>
         </w:rPr>
         <w:t xml:space="preserve">совпадают / отличаются</w:t>
       </w:r>
@@ -6268,7 +6219,6 @@
       <w:r>
         <w:rPr>
           <w:highlight w:val="yellow"/>
-          <w:highlightCs w:val="yellow"/>
         </w:rPr>
         <w:t xml:space="preserve">сравните балл PageSpeed с Performance в GTmetrix</w:t>
       </w:r>

</xml_diff>